<commit_message>
Added UML and Object diagram to pdf
</commit_message>
<xml_diff>
--- a/Practical3PDF.docx
+++ b/Practical3PDF.docx
@@ -275,16 +275,17 @@
         <w:t xml:space="preserve"> is used to communicate important changes to the parts of the event that need to respond. This follows the practical's distinction between Composite as the part-whole structure and Observer as the mechanism for communicating changes.</w:t>
       </w:r>
     </w:p>
-    <w:p>
-      <w:r>
-        <w:t xml:space="preserve">1.2 </w:t>
-      </w:r>
-    </w:p>
     <w:p/>
     <w:p/>
+    <w:p/>
     <w:p>
       <w:r>
         <w:lastRenderedPageBreak/>
+        <w:t xml:space="preserve">1.2 </w:t>
+      </w:r>
+    </w:p>
+    <w:p>
+      <w:r>
         <w:t xml:space="preserve">Composite </w:t>
       </w:r>
     </w:p>
@@ -983,7 +984,51 @@
     </w:p>
     <w:p/>
     <w:p/>
-    <w:p/>
+    <w:p>
+      <w:r>
+        <w:lastRenderedPageBreak/>
+        <w:t>1.3</w:t>
+      </w:r>
+    </w:p>
+    <w:p>
+      <w:r>
+        <w:drawing>
+          <wp:inline distT="0" distB="0" distL="0" distR="0" wp14:anchorId="62C63118" wp14:editId="11CF7E7E">
+            <wp:extent cx="8284464" cy="6126480"/>
+            <wp:effectExtent l="0" t="6985" r="0" b="0"/>
+            <wp:docPr id="1" name="Picture 1"/>
+            <wp:cNvGraphicFramePr>
+              <a:graphicFrameLocks xmlns:a="http://schemas.openxmlformats.org/drawingml/2006/main" noChangeAspect="1"/>
+            </wp:cNvGraphicFramePr>
+            <a:graphic xmlns:a="http://schemas.openxmlformats.org/drawingml/2006/main">
+              <a:graphicData uri="http://schemas.openxmlformats.org/drawingml/2006/picture">
+                <pic:pic xmlns:pic="http://schemas.openxmlformats.org/drawingml/2006/picture">
+                  <pic:nvPicPr>
+                    <pic:cNvPr id="1" name=""/>
+                    <pic:cNvPicPr/>
+                  </pic:nvPicPr>
+                  <pic:blipFill>
+                    <a:blip r:embed="rId7"/>
+                    <a:stretch>
+                      <a:fillRect/>
+                    </a:stretch>
+                  </pic:blipFill>
+                  <pic:spPr>
+                    <a:xfrm rot="16200000">
+                      <a:off x="0" y="0"/>
+                      <a:ext cx="8284464" cy="6126480"/>
+                    </a:xfrm>
+                    <a:prstGeom prst="rect">
+                      <a:avLst/>
+                    </a:prstGeom>
+                  </pic:spPr>
+                </pic:pic>
+              </a:graphicData>
+            </a:graphic>
+          </wp:inline>
+        </w:drawing>
+      </w:r>
+    </w:p>
     <w:p>
       <w:r>
         <w:lastRenderedPageBreak/>
@@ -1245,6 +1290,11 @@
       <w:r>
         <w:t>add() intentionally couples ownership registration with observation registration so that the Composite hierarchy and notification hierarchy remain aligned. This is a deliberate design decision and is reflected in the code</w:t>
       </w:r>
+    </w:p>
+    <w:p>
+      <w:pPr>
+        <w:pStyle w:val="ListParagraph"/>
+      </w:pPr>
     </w:p>
     <w:p/>
     <w:p/>
@@ -1260,6 +1310,206 @@
     </w:p>
     <w:p>
       <w:r>
+        <w:t xml:space="preserve">2.3 </w:t>
+      </w:r>
+      <w:r>
+        <w:rPr>
+          <w:noProof/>
+          <w:lang w:val="en-US"/>
+        </w:rPr>
+        <mc:AlternateContent>
+          <mc:Choice Requires="wps">
+            <w:drawing>
+              <wp:inline distT="0" distB="0" distL="0" distR="0" wp14:anchorId="6E5D1E38" wp14:editId="6B4AADE1">
+                <wp:extent cx="299720" cy="299720"/>
+                <wp:effectExtent l="0" t="0" r="0" b="0"/>
+                <wp:docPr id="3" name="Rectangle 3" descr="blob:https://web.whatsapp.com/d4b7b656-22cd-4a06-847e-e6e03d7f23b8"/>
+                <wp:cNvGraphicFramePr>
+                  <a:graphicFrameLocks xmlns:a="http://schemas.openxmlformats.org/drawingml/2006/main" noChangeAspect="1"/>
+                </wp:cNvGraphicFramePr>
+                <a:graphic xmlns:a="http://schemas.openxmlformats.org/drawingml/2006/main">
+                  <a:graphicData uri="http://schemas.microsoft.com/office/word/2010/wordprocessingShape">
+                    <wps:wsp>
+                      <wps:cNvSpPr>
+                        <a:spLocks noChangeAspect="1" noChangeArrowheads="1"/>
+                      </wps:cNvSpPr>
+                      <wps:spPr bwMode="auto">
+                        <a:xfrm>
+                          <a:off x="0" y="0"/>
+                          <a:ext cx="299720" cy="299720"/>
+                        </a:xfrm>
+                        <a:prstGeom prst="rect">
+                          <a:avLst/>
+                        </a:prstGeom>
+                        <a:noFill/>
+                        <a:ln>
+                          <a:noFill/>
+                        </a:ln>
+                        <a:extLst>
+                          <a:ext uri="{909E8E84-426E-40DD-AFC4-6F175D3DCCD1}">
+                            <a14:hiddenFill xmlns:a14="http://schemas.microsoft.com/office/drawing/2010/main">
+                              <a:solidFill>
+                                <a:srgbClr val="FFFFFF"/>
+                              </a:solidFill>
+                            </a14:hiddenFill>
+                          </a:ext>
+                          <a:ext uri="{91240B29-F687-4F45-9708-019B960494DF}">
+                            <a14:hiddenLine xmlns:a14="http://schemas.microsoft.com/office/drawing/2010/main" w="9525">
+                              <a:solidFill>
+                                <a:srgbClr val="000000"/>
+                              </a:solidFill>
+                              <a:miter lim="800000"/>
+                              <a:headEnd/>
+                              <a:tailEnd/>
+                            </a14:hiddenLine>
+                          </a:ext>
+                        </a:extLst>
+                      </wps:spPr>
+                      <wps:bodyPr rot="0" vert="horz" wrap="square" lIns="91440" tIns="45720" rIns="91440" bIns="45720" anchor="t" anchorCtr="0" upright="1">
+                        <a:noAutofit/>
+                      </wps:bodyPr>
+                    </wps:wsp>
+                  </a:graphicData>
+                </a:graphic>
+              </wp:inline>
+            </w:drawing>
+          </mc:Choice>
+          <mc:Fallback>
+            <w:pict>
+              <v:rect w14:anchorId="0BDFD463" id="Rectangle 3" o:spid="_x0000_s1026" alt="blob:https://web.whatsapp.com/d4b7b656-22cd-4a06-847e-e6e03d7f23b8" style="width:23.6pt;height:23.6pt;visibility:visible;mso-wrap-style:square;mso-left-percent:-10001;mso-top-percent:-10001;mso-position-horizontal:absolute;mso-position-horizontal-relative:char;mso-position-vertical:absolute;mso-position-vertical-relative:line;mso-left-percent:-10001;mso-top-percent:-10001;v-text-anchor:top" o:gfxdata="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" filled="f" stroked="f">
+                <o:lock v:ext="edit" aspectratio="t"/>
+                <w10:anchorlock/>
+              </v:rect>
+            </w:pict>
+          </mc:Fallback>
+        </mc:AlternateContent>
+      </w:r>
+    </w:p>
+    <w:p>
+      <w:r>
+        <w:rPr>
+          <w:noProof/>
+          <w:lang w:val="en-US"/>
+        </w:rPr>
+        <w:drawing>
+          <wp:inline distT="0" distB="0" distL="0" distR="0" wp14:anchorId="396108AA" wp14:editId="56ADF62C">
+            <wp:extent cx="6510528" cy="3813048"/>
+            <wp:effectExtent l="0" t="0" r="5080" b="0"/>
+            <wp:docPr id="4" name="Picture 4"/>
+            <wp:cNvGraphicFramePr>
+              <a:graphicFrameLocks xmlns:a="http://schemas.openxmlformats.org/drawingml/2006/main" noChangeAspect="1"/>
+            </wp:cNvGraphicFramePr>
+            <a:graphic xmlns:a="http://schemas.openxmlformats.org/drawingml/2006/main">
+              <a:graphicData uri="http://schemas.openxmlformats.org/drawingml/2006/picture">
+                <pic:pic xmlns:pic="http://schemas.openxmlformats.org/drawingml/2006/picture">
+                  <pic:nvPicPr>
+                    <pic:cNvPr id="4" name="WhatsApp Image 2026-09-01 at 00.52.01.jpeg"/>
+                    <pic:cNvPicPr/>
+                  </pic:nvPicPr>
+                  <pic:blipFill>
+                    <a:blip r:embed="rId8">
+                      <a:extLst>
+                        <a:ext uri="{28A0092B-C50C-407E-A947-70E740481C1C}">
+                          <a14:useLocalDpi xmlns:a14="http://schemas.microsoft.com/office/drawing/2010/main" val="0"/>
+                        </a:ext>
+                      </a:extLst>
+                    </a:blip>
+                    <a:stretch>
+                      <a:fillRect/>
+                    </a:stretch>
+                  </pic:blipFill>
+                  <pic:spPr>
+                    <a:xfrm>
+                      <a:off x="0" y="0"/>
+                      <a:ext cx="6510528" cy="3813048"/>
+                    </a:xfrm>
+                    <a:prstGeom prst="rect">
+                      <a:avLst/>
+                    </a:prstGeom>
+                  </pic:spPr>
+                </pic:pic>
+              </a:graphicData>
+            </a:graphic>
+          </wp:inline>
+        </w:drawing>
+      </w:r>
+    </w:p>
+    <w:p>
+      <w:r>
+        <w:rPr>
+          <w:noProof/>
+          <w:lang w:val="en-US"/>
+        </w:rPr>
+        <mc:AlternateContent>
+          <mc:Choice Requires="wps">
+            <w:drawing>
+              <wp:inline distT="0" distB="0" distL="0" distR="0" wp14:anchorId="32985E35" wp14:editId="3A91F2B1">
+                <wp:extent cx="299720" cy="299720"/>
+                <wp:effectExtent l="0" t="0" r="0" b="0"/>
+                <wp:docPr id="2" name="Rectangle 2" descr="blob:https://web.whatsapp.com/d4b7b656-22cd-4a06-847e-e6e03d7f23b8"/>
+                <wp:cNvGraphicFramePr>
+                  <a:graphicFrameLocks xmlns:a="http://schemas.openxmlformats.org/drawingml/2006/main" noChangeAspect="1"/>
+                </wp:cNvGraphicFramePr>
+                <a:graphic xmlns:a="http://schemas.openxmlformats.org/drawingml/2006/main">
+                  <a:graphicData uri="http://schemas.microsoft.com/office/word/2010/wordprocessingShape">
+                    <wps:wsp>
+                      <wps:cNvSpPr>
+                        <a:spLocks noChangeAspect="1" noChangeArrowheads="1"/>
+                      </wps:cNvSpPr>
+                      <wps:spPr bwMode="auto">
+                        <a:xfrm>
+                          <a:off x="0" y="0"/>
+                          <a:ext cx="299720" cy="299720"/>
+                        </a:xfrm>
+                        <a:prstGeom prst="rect">
+                          <a:avLst/>
+                        </a:prstGeom>
+                        <a:noFill/>
+                        <a:ln>
+                          <a:noFill/>
+                        </a:ln>
+                        <a:extLst>
+                          <a:ext uri="{909E8E84-426E-40DD-AFC4-6F175D3DCCD1}">
+                            <a14:hiddenFill xmlns:a14="http://schemas.microsoft.com/office/drawing/2010/main">
+                              <a:solidFill>
+                                <a:srgbClr val="FFFFFF"/>
+                              </a:solidFill>
+                            </a14:hiddenFill>
+                          </a:ext>
+                          <a:ext uri="{91240B29-F687-4F45-9708-019B960494DF}">
+                            <a14:hiddenLine xmlns:a14="http://schemas.microsoft.com/office/drawing/2010/main" w="9525">
+                              <a:solidFill>
+                                <a:srgbClr val="000000"/>
+                              </a:solidFill>
+                              <a:miter lim="800000"/>
+                              <a:headEnd/>
+                              <a:tailEnd/>
+                            </a14:hiddenLine>
+                          </a:ext>
+                        </a:extLst>
+                      </wps:spPr>
+                      <wps:bodyPr rot="0" vert="horz" wrap="square" lIns="91440" tIns="45720" rIns="91440" bIns="45720" anchor="t" anchorCtr="0" upright="1">
+                        <a:noAutofit/>
+                      </wps:bodyPr>
+                    </wps:wsp>
+                  </a:graphicData>
+                </a:graphic>
+              </wp:inline>
+            </w:drawing>
+          </mc:Choice>
+          <mc:Fallback>
+            <w:pict>
+              <v:rect w14:anchorId="2B1FE923" id="Rectangle 2" o:spid="_x0000_s1026" alt="blob:https://web.whatsapp.com/d4b7b656-22cd-4a06-847e-e6e03d7f23b8" style="width:23.6pt;height:23.6pt;visibility:visible;mso-wrap-style:square;mso-left-percent:-10001;mso-top-percent:-10001;mso-position-horizontal:absolute;mso-position-horizontal-relative:char;mso-position-vertical:absolute;mso-position-vertical-relative:line;mso-left-percent:-10001;mso-top-percent:-10001;v-text-anchor:top" o:gfxdata="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" filled="f" stroked="f">
+                <o:lock v:ext="edit" aspectratio="t"/>
+                <w10:anchorlock/>
+              </v:rect>
+            </w:pict>
+          </mc:Fallback>
+        </mc:AlternateContent>
+      </w:r>
+    </w:p>
+    <w:p>
+      <w:r>
         <w:t xml:space="preserve">2.4 </w:t>
       </w:r>
     </w:p>
@@ -1292,6 +1542,8 @@
       <w:r>
         <w:t xml:space="preserve"> is issued, each unit responds according to its responsibility:</w:t>
       </w:r>
+      <w:bookmarkStart w:id="0" w:name="_GoBack"/>
+      <w:bookmarkEnd w:id="0"/>
     </w:p>
     <w:p>
       <w:pPr>
@@ -1419,6 +1671,7 @@
           <w:b/>
           <w:bCs/>
         </w:rPr>
+        <w:lastRenderedPageBreak/>
         <w:t>Rule 2 — Capacity Alert</w:t>
       </w:r>
     </w:p>
@@ -1629,7 +1882,6 @@
           <w:b/>
           <w:bCs/>
         </w:rPr>
-        <w:lastRenderedPageBreak/>
         <w:t>Spectator Gate</w:t>
       </w:r>
       <w:r>
@@ -1774,6 +2026,7 @@
           <w:b/>
           <w:bCs/>
         </w:rPr>
+        <w:lastRenderedPageBreak/>
         <w:t>Medical Team</w:t>
       </w:r>
       <w:r>
@@ -1941,121 +2194,124 @@
     <w:p/>
     <w:p>
       <w:r>
+        <w:t>TASK 3</w:t>
+      </w:r>
+    </w:p>
+    <w:p>
+      <w:r>
+        <w:t>3.1 Subject</w:t>
+      </w:r>
+    </w:p>
+    <w:p>
+      <w:r>
+        <w:t xml:space="preserve">Subject defines the common Observer registration operations attach(Observer*), detach(Observer*) and </w:t>
+      </w:r>
+      <w:proofErr w:type="gramStart"/>
+      <w:r>
+        <w:t>notify(</w:t>
+      </w:r>
+      <w:proofErr w:type="spellStart"/>
+      <w:proofErr w:type="gramEnd"/>
+      <w:r>
+        <w:t>const</w:t>
+      </w:r>
+      <w:proofErr w:type="spellEnd"/>
+      <w:r>
+        <w:t xml:space="preserve"> </w:t>
+      </w:r>
+      <w:proofErr w:type="spellStart"/>
+      <w:r>
+        <w:t>EventNotice</w:t>
+      </w:r>
+      <w:proofErr w:type="spellEnd"/>
+      <w:r>
+        <w:t xml:space="preserve">&amp;). The registration list is stored as </w:t>
+      </w:r>
+      <w:proofErr w:type="spellStart"/>
+      <w:proofErr w:type="gramStart"/>
+      <w:r>
+        <w:t>std</w:t>
+      </w:r>
+      <w:proofErr w:type="spellEnd"/>
+      <w:r>
+        <w:t>::</w:t>
+      </w:r>
+      <w:proofErr w:type="gramEnd"/>
+      <w:r>
+        <w:t xml:space="preserve">vector and is non-owning. A null observer is ignored. Duplicate attachment is ignored, so an observer appears at most once in a Subject's list. Detaching an observer that is not registered has no effect.  </w:t>
+      </w:r>
+      <w:proofErr w:type="gramStart"/>
+      <w:r>
+        <w:t>notify(</w:t>
+      </w:r>
+      <w:proofErr w:type="gramEnd"/>
+      <w:r>
+        <w:t>) first takes a snapshot of the current observer list and then calls update(notice) on the snapshot. Consequently, if an observer changes registration during notification, that change does not invalidate the current iteration; it affects the next notification. This gives the design a clear runtime-registration policy</w:t>
+      </w:r>
+    </w:p>
+    <w:p/>
+    <w:p>
+      <w:r>
+        <w:t>3.2 Observer</w:t>
+      </w:r>
+    </w:p>
+    <w:p>
+      <w:r>
+        <w:t xml:space="preserve">Observer is an abstract interface containing </w:t>
+      </w:r>
+      <w:proofErr w:type="gramStart"/>
+      <w:r>
+        <w:t>update(</w:t>
+      </w:r>
+      <w:proofErr w:type="spellStart"/>
+      <w:proofErr w:type="gramEnd"/>
+      <w:r>
+        <w:t>const</w:t>
+      </w:r>
+      <w:proofErr w:type="spellEnd"/>
+      <w:r>
+        <w:t xml:space="preserve"> </w:t>
+      </w:r>
+      <w:proofErr w:type="spellStart"/>
+      <w:r>
+        <w:t>EventNotice</w:t>
+      </w:r>
+      <w:proofErr w:type="spellEnd"/>
+      <w:r>
+        <w:t xml:space="preserve">&amp;). </w:t>
+      </w:r>
+      <w:proofErr w:type="spellStart"/>
+      <w:r>
+        <w:t>EventUnit</w:t>
+      </w:r>
+      <w:proofErr w:type="spellEnd"/>
+      <w:r>
+        <w:t xml:space="preserve"> implements Observer and delegates the notice to the polymorphic </w:t>
+      </w:r>
+      <w:proofErr w:type="spellStart"/>
+      <w:proofErr w:type="gramStart"/>
+      <w:r>
+        <w:t>EventNotice</w:t>
+      </w:r>
+      <w:proofErr w:type="spellEnd"/>
+      <w:r>
+        <w:t>::</w:t>
+      </w:r>
+      <w:proofErr w:type="gramEnd"/>
+      <w:r>
+        <w:t>dispatch(</w:t>
+      </w:r>
+      <w:proofErr w:type="spellStart"/>
+      <w:r>
+        <w:t>EventUnit</w:t>
+      </w:r>
+      <w:proofErr w:type="spellEnd"/>
+      <w:r>
+        <w:t xml:space="preserve">&amp;) operation. Concrete event units then implement </w:t>
+      </w:r>
+      <w:r>
         <w:lastRenderedPageBreak/>
-        <w:t>TASK 3</w:t>
-      </w:r>
-    </w:p>
-    <w:p>
-      <w:r>
-        <w:t>3.1 Subject</w:t>
-      </w:r>
-    </w:p>
-    <w:p>
-      <w:r>
-        <w:t xml:space="preserve">Subject defines the common Observer registration operations attach(Observer*), detach(Observer*) and </w:t>
-      </w:r>
-      <w:proofErr w:type="gramStart"/>
-      <w:r>
-        <w:t>notify(</w:t>
-      </w:r>
-      <w:proofErr w:type="spellStart"/>
-      <w:proofErr w:type="gramEnd"/>
-      <w:r>
-        <w:t>const</w:t>
-      </w:r>
-      <w:proofErr w:type="spellEnd"/>
-      <w:r>
-        <w:t xml:space="preserve"> </w:t>
-      </w:r>
-      <w:proofErr w:type="spellStart"/>
-      <w:r>
-        <w:t>EventNotice</w:t>
-      </w:r>
-      <w:proofErr w:type="spellEnd"/>
-      <w:r>
-        <w:t xml:space="preserve">&amp;). The registration list is stored as </w:t>
-      </w:r>
-      <w:proofErr w:type="spellStart"/>
-      <w:proofErr w:type="gramStart"/>
-      <w:r>
-        <w:t>std</w:t>
-      </w:r>
-      <w:proofErr w:type="spellEnd"/>
-      <w:r>
-        <w:t>::</w:t>
-      </w:r>
-      <w:proofErr w:type="gramEnd"/>
-      <w:r>
-        <w:t xml:space="preserve">vector and is non-owning. A null observer is ignored. Duplicate attachment is ignored, so an observer appears at most once in a Subject's list. Detaching an observer that is not registered has no effect.  </w:t>
-      </w:r>
-      <w:proofErr w:type="gramStart"/>
-      <w:r>
-        <w:t>notify(</w:t>
-      </w:r>
-      <w:proofErr w:type="gramEnd"/>
-      <w:r>
-        <w:t>) first takes a snapshot of the current observer list and then calls update(notice) on the snapshot. Consequently, if an observer changes registration during notification, that change does not invalidate the current iteration; it affects the next notification. This gives the design a clear runtime-registration policy</w:t>
-      </w:r>
-    </w:p>
-    <w:p/>
-    <w:p>
-      <w:r>
-        <w:t>3.2 Observer</w:t>
-      </w:r>
-    </w:p>
-    <w:p>
-      <w:r>
-        <w:t xml:space="preserve">Observer is an abstract interface containing </w:t>
-      </w:r>
-      <w:proofErr w:type="gramStart"/>
-      <w:r>
-        <w:t>update(</w:t>
-      </w:r>
-      <w:proofErr w:type="spellStart"/>
-      <w:proofErr w:type="gramEnd"/>
-      <w:r>
-        <w:t>const</w:t>
-      </w:r>
-      <w:proofErr w:type="spellEnd"/>
-      <w:r>
-        <w:t xml:space="preserve"> </w:t>
-      </w:r>
-      <w:proofErr w:type="spellStart"/>
-      <w:r>
-        <w:t>EventNotice</w:t>
-      </w:r>
-      <w:proofErr w:type="spellEnd"/>
-      <w:r>
-        <w:t xml:space="preserve">&amp;). </w:t>
-      </w:r>
-      <w:proofErr w:type="spellStart"/>
-      <w:r>
-        <w:t>EventUnit</w:t>
-      </w:r>
-      <w:proofErr w:type="spellEnd"/>
-      <w:r>
-        <w:t xml:space="preserve"> implements Observer and delegates the notice to the polymorphic </w:t>
-      </w:r>
-      <w:proofErr w:type="spellStart"/>
-      <w:proofErr w:type="gramStart"/>
-      <w:r>
-        <w:t>EventNotice</w:t>
-      </w:r>
-      <w:proofErr w:type="spellEnd"/>
-      <w:r>
-        <w:t>::</w:t>
-      </w:r>
-      <w:proofErr w:type="gramEnd"/>
-      <w:r>
-        <w:t>dispatch(</w:t>
-      </w:r>
-      <w:proofErr w:type="spellStart"/>
-      <w:r>
-        <w:t>EventUnit</w:t>
-      </w:r>
-      <w:proofErr w:type="spellEnd"/>
-      <w:r>
-        <w:t xml:space="preserve">&amp;) operation. Concrete event units then implement responsibility-specific handlers such as </w:t>
+        <w:t xml:space="preserve">responsibility-specific handlers such as </w:t>
       </w:r>
       <w:proofErr w:type="spellStart"/>
       <w:proofErr w:type="gramStart"/>
@@ -2353,102 +2609,101 @@
         <w:spacing w:after="160" w:line="278" w:lineRule="auto"/>
       </w:pPr>
       <w:r>
+        <w:t>3.5 PUSH MODEL</w:t>
+      </w:r>
+    </w:p>
+    <w:p>
+      <w:r>
+        <w:t xml:space="preserve">The Subject sends the relevant </w:t>
+      </w:r>
+      <w:proofErr w:type="spellStart"/>
+      <w:r>
+        <w:t>EventNotice</w:t>
+      </w:r>
+      <w:proofErr w:type="spellEnd"/>
+      <w:r>
+        <w:t xml:space="preserve"> directly to </w:t>
+      </w:r>
+      <w:proofErr w:type="gramStart"/>
+      <w:r>
+        <w:t>Observer::</w:t>
+      </w:r>
+      <w:proofErr w:type="gramEnd"/>
+      <w:r>
+        <w:t>update(</w:t>
+      </w:r>
+      <w:proofErr w:type="spellStart"/>
+      <w:r>
+        <w:t>const</w:t>
+      </w:r>
+      <w:proofErr w:type="spellEnd"/>
+      <w:r>
+        <w:t xml:space="preserve"> </w:t>
+      </w:r>
+      <w:proofErr w:type="spellStart"/>
+      <w:r>
+        <w:t>EventNotice</w:t>
+      </w:r>
+      <w:proofErr w:type="spellEnd"/>
+      <w:r>
+        <w:t>&amp;). The pushed notice contains the message, severity and concrete notice behaviour needed by the observer. The observer therefore does not need to query the Subject for the current notice.</w:t>
+      </w:r>
+    </w:p>
+    <w:p>
+      <w:r>
+        <w:t xml:space="preserve">Push was selected because </w:t>
+      </w:r>
+      <w:proofErr w:type="spellStart"/>
+      <w:r>
+        <w:t>GameVerse</w:t>
+      </w:r>
+      <w:proofErr w:type="spellEnd"/>
+      <w:r>
+        <w:t xml:space="preserve"> notices already represent the information that observers need. It makes the notification chain explicit, allows the same notice to cascade through </w:t>
+      </w:r>
+      <w:proofErr w:type="spellStart"/>
+      <w:r>
+        <w:t>EventGroups</w:t>
+      </w:r>
+      <w:proofErr w:type="spellEnd"/>
+      <w:r>
+        <w:t>, and lets observers interpret the notice independently. The trade-off is that the notification payload must contain the information observers may require.</w:t>
+      </w:r>
+    </w:p>
+    <w:p/>
+    <w:p>
+      <w:r>
+        <w:t>TASK 4</w:t>
+      </w:r>
+    </w:p>
+    <w:p>
+      <w:r>
+        <w:t>4.3</w:t>
+      </w:r>
+    </w:p>
+    <w:p>
+      <w:r>
+        <w:t xml:space="preserve">The primary new condition uses notice severity. </w:t>
+      </w:r>
+      <w:proofErr w:type="spellStart"/>
+      <w:r>
+        <w:t>EventNotice</w:t>
+      </w:r>
+      <w:proofErr w:type="spellEnd"/>
+      <w:r>
+        <w:t xml:space="preserve"> carries LOW, MEDIUM or HIGH. </w:t>
+      </w:r>
+      <w:proofErr w:type="spellStart"/>
+      <w:r>
+        <w:t>EsportsStage</w:t>
+      </w:r>
+      <w:proofErr w:type="spellEnd"/>
+      <w:r>
+        <w:t xml:space="preserve"> checks the severity it receives. When a HIGH-severity notice </w:t>
+      </w:r>
+      <w:r>
         <w:lastRenderedPageBreak/>
-        <w:t>3.5 PUSH MODEL</w:t>
-      </w:r>
-    </w:p>
-    <w:p>
-      <w:r>
-        <w:t xml:space="preserve">The Subject sends the relevant </w:t>
-      </w:r>
-      <w:proofErr w:type="spellStart"/>
-      <w:r>
-        <w:t>EventNotice</w:t>
-      </w:r>
-      <w:proofErr w:type="spellEnd"/>
-      <w:r>
-        <w:t xml:space="preserve"> directly to </w:t>
-      </w:r>
-      <w:proofErr w:type="gramStart"/>
-      <w:r>
-        <w:t>Observer::</w:t>
-      </w:r>
-      <w:proofErr w:type="gramEnd"/>
-      <w:r>
-        <w:t>update(</w:t>
-      </w:r>
-      <w:proofErr w:type="spellStart"/>
-      <w:r>
-        <w:t>const</w:t>
-      </w:r>
-      <w:proofErr w:type="spellEnd"/>
-      <w:r>
-        <w:t xml:space="preserve"> </w:t>
-      </w:r>
-      <w:proofErr w:type="spellStart"/>
-      <w:r>
-        <w:t>EventNotice</w:t>
-      </w:r>
-      <w:proofErr w:type="spellEnd"/>
-      <w:r>
-        <w:t>&amp;). The pushed notice contains the message, severity and concrete notice behaviour needed by the observer. The observer therefore does not need to query the Subject for the current notice.</w:t>
-      </w:r>
-    </w:p>
-    <w:p>
-      <w:r>
-        <w:t xml:space="preserve">Push was selected because </w:t>
-      </w:r>
-      <w:proofErr w:type="spellStart"/>
-      <w:r>
-        <w:t>GameVerse</w:t>
-      </w:r>
-      <w:proofErr w:type="spellEnd"/>
-      <w:r>
-        <w:t xml:space="preserve"> notices already represent the information that observers need. It makes the notification chain explicit, allows the same notice to cascade through </w:t>
-      </w:r>
-      <w:proofErr w:type="spellStart"/>
-      <w:r>
-        <w:t>EventGroups</w:t>
-      </w:r>
-      <w:proofErr w:type="spellEnd"/>
-      <w:r>
-        <w:t>, and lets observers interpret the notice independently. The trade-off is that the notification payload must contain the information observers may require.</w:t>
-      </w:r>
-    </w:p>
-    <w:p/>
-    <w:p>
-      <w:r>
-        <w:t>TASK 4</w:t>
-      </w:r>
-    </w:p>
-    <w:p>
-      <w:bookmarkStart w:id="0" w:name="_GoBack"/>
-      <w:bookmarkEnd w:id="0"/>
-    </w:p>
-    <w:p>
-      <w:r>
-        <w:t>4.3</w:t>
-      </w:r>
-    </w:p>
-    <w:p>
-      <w:r>
-        <w:t xml:space="preserve">The primary new condition uses notice severity. </w:t>
-      </w:r>
-      <w:proofErr w:type="spellStart"/>
-      <w:r>
-        <w:t>EventNotice</w:t>
-      </w:r>
-      <w:proofErr w:type="spellEnd"/>
-      <w:r>
-        <w:t xml:space="preserve"> carries LOW, MEDIUM or HIGH. </w:t>
-      </w:r>
-      <w:proofErr w:type="spellStart"/>
-      <w:r>
-        <w:t>EsportsStage</w:t>
-      </w:r>
-      <w:proofErr w:type="spellEnd"/>
-      <w:r>
-        <w:t xml:space="preserve"> checks the severity it receives. When a HIGH-severity notice arrives, the stage performs an immediate-attention response before executing the normal notice-specific polymorphic action. Lower-severity notices follow the normal notice-specific response</w:t>
+        <w:t>arrives, the stage performs an immediate-attention response before executing the normal notice-specific polymorphic action. Lower-severity notices follow the normal notice-specific response</w:t>
       </w:r>
     </w:p>
     <w:p/>
@@ -2527,16 +2782,8 @@
         <w:rPr>
           <w:b/>
         </w:rPr>
-        <w:t xml:space="preserve">Announcement </w:t>
-      </w:r>
-      <w:proofErr w:type="spellStart"/>
-      <w:r>
-        <w:rPr>
-          <w:b/>
-        </w:rPr>
-        <w:t>Board</w:t>
-      </w:r>
-      <w:proofErr w:type="spellEnd"/>
+        <w:t>Announcement Board</w:t>
+      </w:r>
     </w:p>
     <w:p>
       <w:pPr>
@@ -2621,11 +2868,7 @@
       </w:r>
       <w:proofErr w:type="spellEnd"/>
       <w:r>
-        <w:t xml:space="preserve">(Subject) at runtime. The demonstration attaches it, attempts a duplicate attachment, detaches it so that it misses the next notice, and then </w:t>
-      </w:r>
-      <w:r>
-        <w:lastRenderedPageBreak/>
-        <w:t xml:space="preserve">re-attaches it. </w:t>
+        <w:t xml:space="preserve">(Subject) at runtime. The demonstration attaches it, attempts a duplicate attachment, detaches it so that it misses the next notice, and then re-attaches it. </w:t>
       </w:r>
       <w:proofErr w:type="gramStart"/>
       <w:r>
@@ -2645,7 +2888,7 @@
       </w:pPr>
     </w:p>
     <w:sectPr>
-      <w:headerReference w:type="default" r:id="rId7"/>
+      <w:headerReference w:type="default" r:id="rId9"/>
       <w:pgSz w:w="11906" w:h="16838"/>
       <w:pgMar w:top="1440" w:right="1440" w:bottom="1440" w:left="1440" w:header="708" w:footer="708" w:gutter="0"/>
       <w:cols w:space="708"/>

</xml_diff>